<commit_message>
Client overview: add BW-to-S/4HANA component mapping section
Co-Authored-By: Claude Fable 5 <noreply@anthropic.com>
Claude-Session: https://claude.ai/code/session_01Rrzn75i6LSkoWt2ciVEJFF
</commit_message>
<xml_diff>
--- a/CCBJI_SupportFee_NewProcess_ClientOverview.docx
+++ b/CCBJI_SupportFee_NewProcess_ClientOverview.docx
@@ -610,7 +610,1255 @@
         <w:rPr>
           <w:color w:val="1F4E79"/>
         </w:rPr>
-        <w:t xml:space="preserve">2. The new process flow — month end</w:t>
+        <w:t xml:space="preserve">2. What existed in BW — and how each piece is handled in S/4HANA</w:t>
+      </w:r>
+    </w:p>
+    <w:p>
+      <w:pPr>
+        <w:spacing w:after="120"/>
+      </w:pPr>
+      <w:r>
+        <w:t xml:space="preserve">Every component of the old BW solution has a defined destination. Nothing is lost; everything is either replaced by S/4 standard, rebuilt inside the new program, or migrated into a new S/4 table.</w:t>
+      </w:r>
+    </w:p>
+    <w:tbl>
+      <w:tblPr>
+        <w:tblW w:type="dxa" w:w="9026"/>
+        <w:tblBorders>
+          <w:top w:val="single" w:color="auto" w:sz="4"/>
+          <w:left w:val="single" w:color="auto" w:sz="4"/>
+          <w:bottom w:val="single" w:color="auto" w:sz="4"/>
+          <w:right w:val="single" w:color="auto" w:sz="4"/>
+          <w:insideH w:val="single" w:color="auto" w:sz="4"/>
+          <w:insideV w:val="single" w:color="auto" w:sz="4"/>
+        </w:tblBorders>
+      </w:tblPr>
+      <w:tblGrid>
+        <w:gridCol w:w="3300"/>
+        <w:gridCol w:w="2500"/>
+        <w:gridCol w:w="3226"/>
+      </w:tblGrid>
+      <w:tr>
+        <w:trPr>
+          <w:tblHeader/>
+        </w:trPr>
+        <w:tc>
+          <w:tcPr>
+            <w:tcW w:type="dxa" w:w="3300"/>
+            <w:shd w:fill="D9E2F3" w:val="clear"/>
+            <w:tcMar>
+              <w:top w:type="dxa" w:w="60"/>
+              <w:left w:type="dxa" w:w="100"/>
+              <w:bottom w:type="dxa" w:w="60"/>
+              <w:right w:type="dxa" w:w="100"/>
+            </w:tcMar>
+          </w:tcPr>
+          <w:p>
+            <w:r>
+              <w:rPr>
+                <w:b/>
+                <w:bCs/>
+                <w:sz w:val="19"/>
+                <w:szCs w:val="19"/>
+              </w:rPr>
+              <w:t xml:space="preserve">Component in BW (old)</w:t>
+            </w:r>
+          </w:p>
+        </w:tc>
+        <w:tc>
+          <w:tcPr>
+            <w:tcW w:type="dxa" w:w="2500"/>
+            <w:shd w:fill="D9E2F3" w:val="clear"/>
+            <w:tcMar>
+              <w:top w:type="dxa" w:w="60"/>
+              <w:left w:type="dxa" w:w="100"/>
+              <w:bottom w:type="dxa" w:w="60"/>
+              <w:right w:type="dxa" w:w="100"/>
+            </w:tcMar>
+          </w:tcPr>
+          <w:p>
+            <w:r>
+              <w:rPr>
+                <w:b/>
+                <w:bCs/>
+                <w:sz w:val="19"/>
+                <w:szCs w:val="19"/>
+              </w:rPr>
+              <w:t xml:space="preserve">What it did</w:t>
+            </w:r>
+          </w:p>
+        </w:tc>
+        <w:tc>
+          <w:tcPr>
+            <w:tcW w:type="dxa" w:w="3226"/>
+            <w:shd w:fill="D9E2F3" w:val="clear"/>
+            <w:tcMar>
+              <w:top w:type="dxa" w:w="60"/>
+              <w:left w:type="dxa" w:w="100"/>
+              <w:bottom w:type="dxa" w:w="60"/>
+              <w:right w:type="dxa" w:w="100"/>
+            </w:tcMar>
+          </w:tcPr>
+          <w:p>
+            <w:r>
+              <w:rPr>
+                <w:b/>
+                <w:bCs/>
+                <w:sz w:val="19"/>
+                <w:szCs w:val="19"/>
+              </w:rPr>
+              <w:t xml:space="preserve">How S/4HANA handles it</w:t>
+            </w:r>
+          </w:p>
+        </w:tc>
+      </w:tr>
+      <w:tr>
+        <w:trPr>
+          <w:tblHeader w:val="false"/>
+        </w:trPr>
+        <w:tc>
+          <w:tcPr>
+            <w:tcW w:type="dxa" w:w="3300"/>
+            <w:tcMar>
+              <w:top w:type="dxa" w:w="60"/>
+              <w:left w:type="dxa" w:w="100"/>
+              <w:bottom w:type="dxa" w:w="60"/>
+              <w:right w:type="dxa" w:w="100"/>
+            </w:tcMar>
+          </w:tcPr>
+          <w:p>
+            <w:r>
+              <w:rPr>
+                <w:b w:val="false"/>
+                <w:bCs w:val="false"/>
+                <w:sz w:val="19"/>
+                <w:szCs w:val="19"/>
+              </w:rPr>
+              <w:t xml:space="preserve">Program ZBW_RUFIGLR_REPORTING_SUPP (+ 3 includes)</w:t>
+            </w:r>
+          </w:p>
+        </w:tc>
+        <w:tc>
+          <w:tcPr>
+            <w:tcW w:type="dxa" w:w="2500"/>
+            <w:tcMar>
+              <w:top w:type="dxa" w:w="60"/>
+              <w:left w:type="dxa" w:w="100"/>
+              <w:bottom w:type="dxa" w:w="60"/>
+              <w:right w:type="dxa" w:w="100"/>
+            </w:tcMar>
+          </w:tcPr>
+          <w:p>
+            <w:r>
+              <w:rPr>
+                <w:b w:val="false"/>
+                <w:bCs w:val="false"/>
+                <w:sz w:val="19"/>
+                <w:szCs w:val="19"/>
+              </w:rPr>
+              <w:t xml:space="preserve">Main support-fee report</w:t>
+            </w:r>
+          </w:p>
+        </w:tc>
+        <w:tc>
+          <w:tcPr>
+            <w:tcW w:type="dxa" w:w="3226"/>
+            <w:tcMar>
+              <w:top w:type="dxa" w:w="60"/>
+              <w:left w:type="dxa" w:w="100"/>
+              <w:bottom w:type="dxa" w:w="60"/>
+              <w:right w:type="dxa" w:w="100"/>
+            </w:tcMar>
+          </w:tcPr>
+          <w:p>
+            <w:r>
+              <w:rPr>
+                <w:b w:val="false"/>
+                <w:bCs w:val="false"/>
+                <w:sz w:val="19"/>
+                <w:szCs w:val="19"/>
+              </w:rPr>
+              <w:t xml:space="preserve">Rebuilt as /CCBJI/RUFIGLR_REPORTING_SUPP (+ 3 includes) with same reports and rules</w:t>
+            </w:r>
+          </w:p>
+        </w:tc>
+      </w:tr>
+      <w:tr>
+        <w:trPr>
+          <w:tblHeader w:val="false"/>
+        </w:trPr>
+        <w:tc>
+          <w:tcPr>
+            <w:tcW w:type="dxa" w:w="3300"/>
+            <w:tcMar>
+              <w:top w:type="dxa" w:w="60"/>
+              <w:left w:type="dxa" w:w="100"/>
+              <w:bottom w:type="dxa" w:w="60"/>
+              <w:right w:type="dxa" w:w="100"/>
+            </w:tcMar>
+          </w:tcPr>
+          <w:p>
+            <w:r>
+              <w:rPr>
+                <w:b w:val="false"/>
+                <w:bCs w:val="false"/>
+                <w:sz w:val="19"/>
+                <w:szCs w:val="19"/>
+              </w:rPr>
+              <w:t xml:space="preserve">HANA calculation views ZJ_SUPPORT_FEE_CF_001, _TYPE_F_001, _PRCTR_02, DATA_001/_BA/_F</w:t>
+            </w:r>
+          </w:p>
+        </w:tc>
+        <w:tc>
+          <w:tcPr>
+            <w:tcW w:type="dxa" w:w="2500"/>
+            <w:tcMar>
+              <w:top w:type="dxa" w:w="60"/>
+              <w:left w:type="dxa" w:w="100"/>
+              <w:bottom w:type="dxa" w:w="60"/>
+              <w:right w:type="dxa" w:w="100"/>
+            </w:tcMar>
+          </w:tcPr>
+          <w:p>
+            <w:r>
+              <w:rPr>
+                <w:b w:val="false"/>
+                <w:bCs w:val="false"/>
+                <w:sz w:val="19"/>
+                <w:szCs w:val="19"/>
+              </w:rPr>
+              <w:t xml:space="preserve">Selected and joined FI + COPA data, record-type filters, de-duplication, profit-center logic</w:t>
+            </w:r>
+          </w:p>
+        </w:tc>
+        <w:tc>
+          <w:tcPr>
+            <w:tcW w:type="dxa" w:w="3226"/>
+            <w:tcMar>
+              <w:top w:type="dxa" w:w="60"/>
+              <w:left w:type="dxa" w:w="100"/>
+              <w:bottom w:type="dxa" w:w="60"/>
+              <w:right w:type="dxa" w:w="100"/>
+            </w:tcMar>
+          </w:tcPr>
+          <w:p>
+            <w:r>
+              <w:rPr>
+                <w:b w:val="false"/>
+                <w:bCs w:val="false"/>
+                <w:sz w:val="19"/>
+                <w:szCs w:val="19"/>
+              </w:rPr>
+              <w:t xml:space="preserve">Logic rebuilt inside the ABAP program as database-aggregated reads on ACDOCA — no views needed</w:t>
+            </w:r>
+          </w:p>
+        </w:tc>
+      </w:tr>
+      <w:tr>
+        <w:trPr>
+          <w:tblHeader w:val="false"/>
+        </w:trPr>
+        <w:tc>
+          <w:tcPr>
+            <w:tcW w:type="dxa" w:w="3300"/>
+            <w:tcMar>
+              <w:top w:type="dxa" w:w="60"/>
+              <w:left w:type="dxa" w:w="100"/>
+              <w:bottom w:type="dxa" w:w="60"/>
+              <w:right w:type="dxa" w:w="100"/>
+            </w:tcMar>
+          </w:tcPr>
+          <w:p>
+            <w:r>
+              <w:rPr>
+                <w:b w:val="false"/>
+                <w:bCs w:val="false"/>
+                <w:sz w:val="19"/>
+                <w:szCs w:val="19"/>
+              </w:rPr>
+              <w:t xml:space="preserve">AMDP classes ZJRTR_CL_GET_COPA_SF, ZJRTR_CL_SUPP_FEE_ALLOC</w:t>
+            </w:r>
+          </w:p>
+        </w:tc>
+        <w:tc>
+          <w:tcPr>
+            <w:tcW w:type="dxa" w:w="2500"/>
+            <w:tcMar>
+              <w:top w:type="dxa" w:w="60"/>
+              <w:left w:type="dxa" w:w="100"/>
+              <w:bottom w:type="dxa" w:w="60"/>
+              <w:right w:type="dxa" w:w="100"/>
+            </w:tcMar>
+          </w:tcPr>
+          <w:p>
+            <w:r>
+              <w:rPr>
+                <w:b w:val="false"/>
+                <w:bCs w:val="false"/>
+                <w:sz w:val="19"/>
+                <w:szCs w:val="19"/>
+              </w:rPr>
+              <w:t xml:space="preserve">Bridge between ABAP and the HANA views</w:t>
+            </w:r>
+          </w:p>
+        </w:tc>
+        <w:tc>
+          <w:tcPr>
+            <w:tcW w:type="dxa" w:w="3226"/>
+            <w:tcMar>
+              <w:top w:type="dxa" w:w="60"/>
+              <w:left w:type="dxa" w:w="100"/>
+              <w:bottom w:type="dxa" w:w="60"/>
+              <w:right w:type="dxa" w:w="100"/>
+            </w:tcMar>
+          </w:tcPr>
+          <w:p>
+            <w:r>
+              <w:rPr>
+                <w:b w:val="false"/>
+                <w:bCs w:val="false"/>
+                <w:sz w:val="19"/>
+                <w:szCs w:val="19"/>
+              </w:rPr>
+              <w:t xml:space="preserve">Not needed — the program reads ACDOCA directly</w:t>
+            </w:r>
+          </w:p>
+        </w:tc>
+      </w:tr>
+      <w:tr>
+        <w:trPr>
+          <w:tblHeader w:val="false"/>
+        </w:trPr>
+        <w:tc>
+          <w:tcPr>
+            <w:tcW w:type="dxa" w:w="3300"/>
+            <w:tcMar>
+              <w:top w:type="dxa" w:w="60"/>
+              <w:left w:type="dxa" w:w="100"/>
+              <w:bottom w:type="dxa" w:w="60"/>
+              <w:right w:type="dxa" w:w="100"/>
+            </w:tcMar>
+          </w:tcPr>
+          <w:p>
+            <w:r>
+              <w:rPr>
+                <w:b w:val="false"/>
+                <w:bCs w:val="false"/>
+                <w:sz w:val="19"/>
+                <w:szCs w:val="19"/>
+              </w:rPr>
+              <w:t xml:space="preserve">BW copies of CE1JP00 (COPA) and FAGLFLEXA (FI)</w:t>
+            </w:r>
+          </w:p>
+        </w:tc>
+        <w:tc>
+          <w:tcPr>
+            <w:tcW w:type="dxa" w:w="2500"/>
+            <w:tcMar>
+              <w:top w:type="dxa" w:w="60"/>
+              <w:left w:type="dxa" w:w="100"/>
+              <w:bottom w:type="dxa" w:w="60"/>
+              <w:right w:type="dxa" w:w="100"/>
+            </w:tcMar>
+          </w:tcPr>
+          <w:p>
+            <w:r>
+              <w:rPr>
+                <w:b w:val="false"/>
+                <w:bCs w:val="false"/>
+                <w:sz w:val="19"/>
+                <w:szCs w:val="19"/>
+              </w:rPr>
+              <w:t xml:space="preserve">Data basis, loaded from ECC</w:t>
+            </w:r>
+          </w:p>
+        </w:tc>
+        <w:tc>
+          <w:tcPr>
+            <w:tcW w:type="dxa" w:w="3226"/>
+            <w:tcMar>
+              <w:top w:type="dxa" w:w="60"/>
+              <w:left w:type="dxa" w:w="100"/>
+              <w:bottom w:type="dxa" w:w="60"/>
+              <w:right w:type="dxa" w:w="100"/>
+            </w:tcMar>
+          </w:tcPr>
+          <w:p>
+            <w:r>
+              <w:rPr>
+                <w:b w:val="false"/>
+                <w:bCs w:val="false"/>
+                <w:sz w:val="19"/>
+                <w:szCs w:val="19"/>
+              </w:rPr>
+              <w:t xml:space="preserve">ACDOCA — live data, no loading, always current</w:t>
+            </w:r>
+          </w:p>
+        </w:tc>
+      </w:tr>
+      <w:tr>
+        <w:trPr>
+          <w:tblHeader w:val="false"/>
+        </w:trPr>
+        <w:tc>
+          <w:tcPr>
+            <w:tcW w:type="dxa" w:w="3300"/>
+            <w:tcMar>
+              <w:top w:type="dxa" w:w="60"/>
+              <w:left w:type="dxa" w:w="100"/>
+              <w:bottom w:type="dxa" w:w="60"/>
+              <w:right w:type="dxa" w:w="100"/>
+            </w:tcMar>
+          </w:tcPr>
+          <w:p>
+            <w:r>
+              <w:rPr>
+                <w:b w:val="false"/>
+                <w:bCs w:val="false"/>
+                <w:sz w:val="19"/>
+                <w:szCs w:val="19"/>
+              </w:rPr>
+              <w:t xml:space="preserve">Record type VRGAR (F, 1–9, B)</w:t>
+            </w:r>
+          </w:p>
+        </w:tc>
+        <w:tc>
+          <w:tcPr>
+            <w:tcW w:type="dxa" w:w="2500"/>
+            <w:tcMar>
+              <w:top w:type="dxa" w:w="60"/>
+              <w:left w:type="dxa" w:w="100"/>
+              <w:bottom w:type="dxa" w:w="60"/>
+              <w:right w:type="dxa" w:w="100"/>
+            </w:tcMar>
+          </w:tcPr>
+          <w:p>
+            <w:r>
+              <w:rPr>
+                <w:b w:val="false"/>
+                <w:bCs w:val="false"/>
+                <w:sz w:val="19"/>
+                <w:szCs w:val="19"/>
+              </w:rPr>
+              <w:t xml:space="preserve">Classified the origin of each COPA line</w:t>
+            </w:r>
+          </w:p>
+        </w:tc>
+        <w:tc>
+          <w:tcPr>
+            <w:tcW w:type="dxa" w:w="3226"/>
+            <w:tcMar>
+              <w:top w:type="dxa" w:w="60"/>
+              <w:left w:type="dxa" w:w="100"/>
+              <w:bottom w:type="dxa" w:w="60"/>
+              <w:right w:type="dxa" w:w="100"/>
+            </w:tcMar>
+          </w:tcPr>
+          <w:p>
+            <w:r>
+              <w:rPr>
+                <w:b w:val="false"/>
+                <w:bCs w:val="false"/>
+                <w:sz w:val="19"/>
+                <w:szCs w:val="19"/>
+              </w:rPr>
+              <w:t xml:space="preserve">Combination of AWTYP + document type in ACDOCA (validated against real 7827 data)</w:t>
+            </w:r>
+          </w:p>
+        </w:tc>
+      </w:tr>
+      <w:tr>
+        <w:trPr>
+          <w:tblHeader w:val="false"/>
+        </w:trPr>
+        <w:tc>
+          <w:tcPr>
+            <w:tcW w:type="dxa" w:w="3300"/>
+            <w:tcMar>
+              <w:top w:type="dxa" w:w="60"/>
+              <w:left w:type="dxa" w:w="100"/>
+              <w:bottom w:type="dxa" w:w="60"/>
+              <w:right w:type="dxa" w:w="100"/>
+            </w:tcMar>
+          </w:tcPr>
+          <w:p>
+            <w:r>
+              <w:rPr>
+                <w:b w:val="false"/>
+                <w:bCs w:val="false"/>
+                <w:sz w:val="19"/>
+                <w:szCs w:val="19"/>
+              </w:rPr>
+              <w:t xml:space="preserve">/BIC/AZJDMAPGL2 (GL mapping)</w:t>
+            </w:r>
+          </w:p>
+        </w:tc>
+        <w:tc>
+          <w:tcPr>
+            <w:tcW w:type="dxa" w:w="2500"/>
+            <w:tcMar>
+              <w:top w:type="dxa" w:w="60"/>
+              <w:left w:type="dxa" w:w="100"/>
+              <w:bottom w:type="dxa" w:w="60"/>
+              <w:right w:type="dxa" w:w="100"/>
+            </w:tcMar>
+          </w:tcPr>
+          <w:p>
+            <w:r>
+              <w:rPr>
+                <w:b w:val="false"/>
+                <w:bCs w:val="false"/>
+                <w:sz w:val="19"/>
+                <w:szCs w:val="19"/>
+              </w:rPr>
+              <w:t xml:space="preserve">Expense GL → debit/credit accounts, tax code</w:t>
+            </w:r>
+          </w:p>
+        </w:tc>
+        <w:tc>
+          <w:tcPr>
+            <w:tcW w:type="dxa" w:w="3226"/>
+            <w:tcMar>
+              <w:top w:type="dxa" w:w="60"/>
+              <w:left w:type="dxa" w:w="100"/>
+              <w:bottom w:type="dxa" w:w="60"/>
+              <w:right w:type="dxa" w:w="100"/>
+            </w:tcMar>
+          </w:tcPr>
+          <w:p>
+            <w:r>
+              <w:rPr>
+                <w:b w:val="false"/>
+                <w:bCs w:val="false"/>
+                <w:sz w:val="19"/>
+                <w:szCs w:val="19"/>
+              </w:rPr>
+              <w:t xml:space="preserve">Already exists in S/4 as /CCBJI/T_MAP_GL (1,358 entries) — reused as-is</w:t>
+            </w:r>
+          </w:p>
+        </w:tc>
+      </w:tr>
+      <w:tr>
+        <w:trPr>
+          <w:tblHeader w:val="false"/>
+        </w:trPr>
+        <w:tc>
+          <w:tcPr>
+            <w:tcW w:type="dxa" w:w="3300"/>
+            <w:tcMar>
+              <w:top w:type="dxa" w:w="60"/>
+              <w:left w:type="dxa" w:w="100"/>
+              <w:bottom w:type="dxa" w:w="60"/>
+              <w:right w:type="dxa" w:w="100"/>
+            </w:tcMar>
+          </w:tcPr>
+          <w:p>
+            <w:r>
+              <w:rPr>
+                <w:b w:val="false"/>
+                <w:bCs w:val="false"/>
+                <w:sz w:val="19"/>
+                <w:szCs w:val="19"/>
+              </w:rPr>
+              <w:t xml:space="preserve">/BIC/AZJDSUPFEE2 (incidence %)</w:t>
+            </w:r>
+          </w:p>
+        </w:tc>
+        <w:tc>
+          <w:tcPr>
+            <w:tcW w:type="dxa" w:w="2500"/>
+            <w:tcMar>
+              <w:top w:type="dxa" w:w="60"/>
+              <w:left w:type="dxa" w:w="100"/>
+              <w:bottom w:type="dxa" w:w="60"/>
+              <w:right w:type="dxa" w:w="100"/>
+            </w:tcMar>
+          </w:tcPr>
+          <w:p>
+            <w:r>
+              <w:rPr>
+                <w:b w:val="false"/>
+                <w:bCs w:val="false"/>
+                <w:sz w:val="19"/>
+                <w:szCs w:val="19"/>
+              </w:rPr>
+              <w:t xml:space="preserve">The rate master</w:t>
+            </w:r>
+          </w:p>
+        </w:tc>
+        <w:tc>
+          <w:tcPr>
+            <w:tcW w:type="dxa" w:w="3226"/>
+            <w:tcMar>
+              <w:top w:type="dxa" w:w="60"/>
+              <w:left w:type="dxa" w:w="100"/>
+              <w:bottom w:type="dxa" w:w="60"/>
+              <w:right w:type="dxa" w:w="100"/>
+            </w:tcMar>
+          </w:tcPr>
+          <w:p>
+            <w:r>
+              <w:rPr>
+                <w:b w:val="false"/>
+                <w:bCs w:val="false"/>
+                <w:sz w:val="19"/>
+                <w:szCs w:val="19"/>
+              </w:rPr>
+              <w:t xml:space="preserve">Already exists in S/4 as /CCBJI/T_SUP_FEE — reused as-is</w:t>
+            </w:r>
+          </w:p>
+        </w:tc>
+      </w:tr>
+      <w:tr>
+        <w:trPr>
+          <w:tblHeader w:val="false"/>
+        </w:trPr>
+        <w:tc>
+          <w:tcPr>
+            <w:tcW w:type="dxa" w:w="3300"/>
+            <w:tcMar>
+              <w:top w:type="dxa" w:w="60"/>
+              <w:left w:type="dxa" w:w="100"/>
+              <w:bottom w:type="dxa" w:w="60"/>
+              <w:right w:type="dxa" w:w="100"/>
+            </w:tcMar>
+          </w:tcPr>
+          <w:p>
+            <w:r>
+              <w:rPr>
+                <w:b w:val="false"/>
+                <w:bCs w:val="false"/>
+                <w:sz w:val="19"/>
+                <w:szCs w:val="19"/>
+              </w:rPr>
+              <w:t xml:space="preserve">/BIC/AZKAMORGL42 (KAM L4 mapping)</w:t>
+            </w:r>
+          </w:p>
+        </w:tc>
+        <w:tc>
+          <w:tcPr>
+            <w:tcW w:type="dxa" w:w="2500"/>
+            <w:tcMar>
+              <w:top w:type="dxa" w:w="60"/>
+              <w:left w:type="dxa" w:w="100"/>
+              <w:bottom w:type="dxa" w:w="60"/>
+              <w:right w:type="dxa" w:w="100"/>
+            </w:tcMar>
+          </w:tcPr>
+          <w:p>
+            <w:r>
+              <w:rPr>
+                <w:b w:val="false"/>
+                <w:bCs w:val="false"/>
+                <w:sz w:val="19"/>
+                <w:szCs w:val="19"/>
+              </w:rPr>
+              <w:t xml:space="preserve">KAM Level-4 code → cost center</w:t>
+            </w:r>
+          </w:p>
+        </w:tc>
+        <w:tc>
+          <w:tcPr>
+            <w:tcW w:type="dxa" w:w="3226"/>
+            <w:tcMar>
+              <w:top w:type="dxa" w:w="60"/>
+              <w:left w:type="dxa" w:w="100"/>
+              <w:bottom w:type="dxa" w:w="60"/>
+              <w:right w:type="dxa" w:w="100"/>
+            </w:tcMar>
+          </w:tcPr>
+          <w:p>
+            <w:r>
+              <w:rPr>
+                <w:b w:val="false"/>
+                <w:bCs w:val="false"/>
+                <w:sz w:val="19"/>
+                <w:szCs w:val="19"/>
+              </w:rPr>
+              <w:t xml:space="preserve">NEW table /CCBJI/T_KAM_L4_CC + new upload program (data migrated: 115 rows)</w:t>
+            </w:r>
+          </w:p>
+        </w:tc>
+      </w:tr>
+      <w:tr>
+        <w:trPr>
+          <w:tblHeader w:val="false"/>
+        </w:trPr>
+        <w:tc>
+          <w:tcPr>
+            <w:tcW w:type="dxa" w:w="3300"/>
+            <w:tcMar>
+              <w:top w:type="dxa" w:w="60"/>
+              <w:left w:type="dxa" w:w="100"/>
+              <w:bottom w:type="dxa" w:w="60"/>
+              <w:right w:type="dxa" w:w="100"/>
+            </w:tcMar>
+          </w:tcPr>
+          <w:p>
+            <w:r>
+              <w:rPr>
+                <w:b w:val="false"/>
+                <w:bCs w:val="false"/>
+                <w:sz w:val="19"/>
+                <w:szCs w:val="19"/>
+              </w:rPr>
+              <w:t xml:space="preserve">/BIC/AZJSUFEECE2 (cost element mapping)</w:t>
+            </w:r>
+          </w:p>
+        </w:tc>
+        <w:tc>
+          <w:tcPr>
+            <w:tcW w:type="dxa" w:w="2500"/>
+            <w:tcMar>
+              <w:top w:type="dxa" w:w="60"/>
+              <w:left w:type="dxa" w:w="100"/>
+              <w:bottom w:type="dxa" w:w="60"/>
+              <w:right w:type="dxa" w:w="100"/>
+            </w:tcMar>
+          </w:tcPr>
+          <w:p>
+            <w:r>
+              <w:rPr>
+                <w:b w:val="false"/>
+                <w:bCs w:val="false"/>
+                <w:sz w:val="19"/>
+                <w:szCs w:val="19"/>
+              </w:rPr>
+              <w:t xml:space="preserve">Cost element for COPA posting</w:t>
+            </w:r>
+          </w:p>
+        </w:tc>
+        <w:tc>
+          <w:tcPr>
+            <w:tcW w:type="dxa" w:w="3226"/>
+            <w:tcMar>
+              <w:top w:type="dxa" w:w="60"/>
+              <w:left w:type="dxa" w:w="100"/>
+              <w:bottom w:type="dxa" w:w="60"/>
+              <w:right w:type="dxa" w:w="100"/>
+            </w:tcMar>
+          </w:tcPr>
+          <w:p>
+            <w:r>
+              <w:rPr>
+                <w:b w:val="false"/>
+                <w:bCs w:val="false"/>
+                <w:sz w:val="19"/>
+                <w:szCs w:val="19"/>
+              </w:rPr>
+              <w:t xml:space="preserve">NEW table /CCBJI/T_SUPFEE_CE (data migrated: 16 rows)</w:t>
+            </w:r>
+          </w:p>
+        </w:tc>
+      </w:tr>
+      <w:tr>
+        <w:trPr>
+          <w:tblHeader w:val="false"/>
+        </w:trPr>
+        <w:tc>
+          <w:tcPr>
+            <w:tcW w:type="dxa" w:w="3300"/>
+            <w:tcMar>
+              <w:top w:type="dxa" w:w="60"/>
+              <w:left w:type="dxa" w:w="100"/>
+              <w:bottom w:type="dxa" w:w="60"/>
+              <w:right w:type="dxa" w:w="100"/>
+            </w:tcMar>
+          </w:tcPr>
+          <w:p>
+            <w:r>
+              <w:rPr>
+                <w:b w:val="false"/>
+                <w:bCs w:val="false"/>
+                <w:sz w:val="19"/>
+                <w:szCs w:val="19"/>
+              </w:rPr>
+              <w:t xml:space="preserve">Upload program ZJRTR_RUCOPBR_HANA_ALLOC_UPLD</w:t>
+            </w:r>
+          </w:p>
+        </w:tc>
+        <w:tc>
+          <w:tcPr>
+            <w:tcW w:type="dxa" w:w="2500"/>
+            <w:tcMar>
+              <w:top w:type="dxa" w:w="60"/>
+              <w:left w:type="dxa" w:w="100"/>
+              <w:bottom w:type="dxa" w:w="60"/>
+              <w:right w:type="dxa" w:w="100"/>
+            </w:tcMar>
+          </w:tcPr>
+          <w:p>
+            <w:r>
+              <w:rPr>
+                <w:b w:val="false"/>
+                <w:bCs w:val="false"/>
+                <w:sz w:val="19"/>
+                <w:szCs w:val="19"/>
+              </w:rPr>
+              <w:t xml:space="preserve">CSV upload of KAM L4 mapping into BW</w:t>
+            </w:r>
+          </w:p>
+        </w:tc>
+        <w:tc>
+          <w:tcPr>
+            <w:tcW w:type="dxa" w:w="3226"/>
+            <w:tcMar>
+              <w:top w:type="dxa" w:w="60"/>
+              <w:left w:type="dxa" w:w="100"/>
+              <w:bottom w:type="dxa" w:w="60"/>
+              <w:right w:type="dxa" w:w="100"/>
+            </w:tcMar>
+          </w:tcPr>
+          <w:p>
+            <w:r>
+              <w:rPr>
+                <w:b w:val="false"/>
+                <w:bCs w:val="false"/>
+                <w:sz w:val="19"/>
+                <w:szCs w:val="19"/>
+              </w:rPr>
+              <w:t xml:space="preserve">NEW simpler upload program with own transaction, plus validations the old one did not have</w:t>
+            </w:r>
+          </w:p>
+        </w:tc>
+      </w:tr>
+      <w:tr>
+        <w:trPr>
+          <w:tblHeader w:val="false"/>
+        </w:trPr>
+        <w:tc>
+          <w:tcPr>
+            <w:tcW w:type="dxa" w:w="3300"/>
+            <w:tcMar>
+              <w:top w:type="dxa" w:w="60"/>
+              <w:left w:type="dxa" w:w="100"/>
+              <w:bottom w:type="dxa" w:w="60"/>
+              <w:right w:type="dxa" w:w="100"/>
+            </w:tcMar>
+          </w:tcPr>
+          <w:p>
+            <w:r>
+              <w:rPr>
+                <w:b w:val="false"/>
+                <w:bCs w:val="false"/>
+                <w:sz w:val="19"/>
+                <w:szCs w:val="19"/>
+              </w:rPr>
+              <w:t xml:space="preserve">Text file on AL11 server + ECC program /CCBJI/RUFIGLR_SUPPFI_POST</w:t>
+            </w:r>
+          </w:p>
+        </w:tc>
+        <w:tc>
+          <w:tcPr>
+            <w:tcW w:type="dxa" w:w="2500"/>
+            <w:tcMar>
+              <w:top w:type="dxa" w:w="60"/>
+              <w:left w:type="dxa" w:w="100"/>
+              <w:bottom w:type="dxa" w:w="60"/>
+              <w:right w:type="dxa" w:w="100"/>
+            </w:tcMar>
+          </w:tcPr>
+          <w:p>
+            <w:r>
+              <w:rPr>
+                <w:b w:val="false"/>
+                <w:bCs w:val="false"/>
+                <w:sz w:val="19"/>
+                <w:szCs w:val="19"/>
+              </w:rPr>
+              <w:t xml:space="preserve">Transported results to ECC and posted FI documents there</w:t>
+            </w:r>
+          </w:p>
+        </w:tc>
+        <w:tc>
+          <w:tcPr>
+            <w:tcW w:type="dxa" w:w="3226"/>
+            <w:tcMar>
+              <w:top w:type="dxa" w:w="60"/>
+              <w:left w:type="dxa" w:w="100"/>
+              <w:bottom w:type="dxa" w:w="60"/>
+              <w:right w:type="dxa" w:w="100"/>
+            </w:tcMar>
+          </w:tcPr>
+          <w:p>
+            <w:r>
+              <w:rPr>
+                <w:b w:val="false"/>
+                <w:bCs w:val="false"/>
+                <w:sz w:val="19"/>
+                <w:szCs w:val="19"/>
+              </w:rPr>
+              <w:t xml:space="preserve">Direct posting inside the same S/4 program — same document layout (type YE, debit/credit/tax lines), no files, no second system</w:t>
+            </w:r>
+          </w:p>
+        </w:tc>
+      </w:tr>
+      <w:tr>
+        <w:trPr>
+          <w:tblHeader w:val="false"/>
+        </w:trPr>
+        <w:tc>
+          <w:tcPr>
+            <w:tcW w:type="dxa" w:w="3300"/>
+            <w:tcMar>
+              <w:top w:type="dxa" w:w="60"/>
+              <w:left w:type="dxa" w:w="100"/>
+              <w:bottom w:type="dxa" w:w="60"/>
+              <w:right w:type="dxa" w:w="100"/>
+            </w:tcMar>
+          </w:tcPr>
+          <w:p>
+            <w:r>
+              <w:rPr>
+                <w:b w:val="false"/>
+                <w:bCs w:val="false"/>
+                <w:sz w:val="19"/>
+                <w:szCs w:val="19"/>
+              </w:rPr>
+              <w:t xml:space="preserve">HANA staging table ZJ_SUPPORT_FEE_PER</w:t>
+            </w:r>
+          </w:p>
+        </w:tc>
+        <w:tc>
+          <w:tcPr>
+            <w:tcW w:type="dxa" w:w="2500"/>
+            <w:tcMar>
+              <w:top w:type="dxa" w:w="60"/>
+              <w:left w:type="dxa" w:w="100"/>
+              <w:bottom w:type="dxa" w:w="60"/>
+              <w:right w:type="dxa" w:w="100"/>
+            </w:tcMar>
+          </w:tcPr>
+          <w:p>
+            <w:r>
+              <w:rPr>
+                <w:b w:val="false"/>
+                <w:bCs w:val="false"/>
+                <w:sz w:val="19"/>
+                <w:szCs w:val="19"/>
+              </w:rPr>
+              <w:t xml:space="preserve">Intermediate storage between calculation and posting</w:t>
+            </w:r>
+          </w:p>
+        </w:tc>
+        <w:tc>
+          <w:tcPr>
+            <w:tcW w:type="dxa" w:w="3226"/>
+            <w:tcMar>
+              <w:top w:type="dxa" w:w="60"/>
+              <w:left w:type="dxa" w:w="100"/>
+              <w:bottom w:type="dxa" w:w="60"/>
+              <w:right w:type="dxa" w:w="100"/>
+            </w:tcMar>
+          </w:tcPr>
+          <w:p>
+            <w:r>
+              <w:rPr>
+                <w:b w:val="false"/>
+                <w:bCs w:val="false"/>
+                <w:sz w:val="19"/>
+                <w:szCs w:val="19"/>
+              </w:rPr>
+              <w:t xml:space="preserve">Not needed — processed in memory within one run</w:t>
+            </w:r>
+          </w:p>
+        </w:tc>
+      </w:tr>
+      <w:tr>
+        <w:trPr>
+          <w:tblHeader w:val="false"/>
+        </w:trPr>
+        <w:tc>
+          <w:tcPr>
+            <w:tcW w:type="dxa" w:w="3300"/>
+            <w:tcMar>
+              <w:top w:type="dxa" w:w="60"/>
+              <w:left w:type="dxa" w:w="100"/>
+              <w:bottom w:type="dxa" w:w="60"/>
+              <w:right w:type="dxa" w:w="100"/>
+            </w:tcMar>
+          </w:tcPr>
+          <w:p>
+            <w:r>
+              <w:rPr>
+                <w:b w:val="false"/>
+                <w:bCs w:val="false"/>
+                <w:sz w:val="19"/>
+                <w:szCs w:val="19"/>
+              </w:rPr>
+              <w:t xml:space="preserve">RKEVEXT3 background job</w:t>
+            </w:r>
+          </w:p>
+        </w:tc>
+        <w:tc>
+          <w:tcPr>
+            <w:tcW w:type="dxa" w:w="2500"/>
+            <w:tcMar>
+              <w:top w:type="dxa" w:w="60"/>
+              <w:left w:type="dxa" w:w="100"/>
+              <w:bottom w:type="dxa" w:w="60"/>
+              <w:right w:type="dxa" w:w="100"/>
+            </w:tcMar>
+          </w:tcPr>
+          <w:p>
+            <w:r>
+              <w:rPr>
+                <w:b w:val="false"/>
+                <w:bCs w:val="false"/>
+                <w:sz w:val="19"/>
+                <w:szCs w:val="19"/>
+              </w:rPr>
+              <w:t xml:space="preserve">Posted the COPA side in ECC</w:t>
+            </w:r>
+          </w:p>
+        </w:tc>
+        <w:tc>
+          <w:tcPr>
+            <w:tcW w:type="dxa" w:w="3226"/>
+            <w:tcMar>
+              <w:top w:type="dxa" w:w="60"/>
+              <w:left w:type="dxa" w:w="100"/>
+              <w:bottom w:type="dxa" w:w="60"/>
+              <w:right w:type="dxa" w:w="100"/>
+            </w:tcMar>
+          </w:tcPr>
+          <w:p>
+            <w:r>
+              <w:rPr>
+                <w:b w:val="false"/>
+                <w:bCs w:val="false"/>
+                <w:sz w:val="19"/>
+                <w:szCs w:val="19"/>
+              </w:rPr>
+              <w:t xml:space="preserve">COPA (profitability) information posted together with the FI document in the same BAPI call</w:t>
+            </w:r>
+          </w:p>
+        </w:tc>
+      </w:tr>
+      <w:tr>
+        <w:trPr>
+          <w:tblHeader w:val="false"/>
+        </w:trPr>
+        <w:tc>
+          <w:tcPr>
+            <w:tcW w:type="dxa" w:w="3300"/>
+            <w:tcMar>
+              <w:top w:type="dxa" w:w="60"/>
+              <w:left w:type="dxa" w:w="100"/>
+              <w:bottom w:type="dxa" w:w="60"/>
+              <w:right w:type="dxa" w:w="100"/>
+            </w:tcMar>
+          </w:tcPr>
+          <w:p>
+            <w:r>
+              <w:rPr>
+                <w:b w:val="false"/>
+                <w:bCs w:val="false"/>
+                <w:sz w:val="19"/>
+                <w:szCs w:val="19"/>
+              </w:rPr>
+              <w:t xml:space="preserve">Number range Z_SUPP_FEE (interval Z1)</w:t>
+            </w:r>
+          </w:p>
+        </w:tc>
+        <w:tc>
+          <w:tcPr>
+            <w:tcW w:type="dxa" w:w="2500"/>
+            <w:tcMar>
+              <w:top w:type="dxa" w:w="60"/>
+              <w:left w:type="dxa" w:w="100"/>
+              <w:bottom w:type="dxa" w:w="60"/>
+              <w:right w:type="dxa" w:w="100"/>
+            </w:tcMar>
+          </w:tcPr>
+          <w:p>
+            <w:r>
+              <w:rPr>
+                <w:b w:val="false"/>
+                <w:bCs w:val="false"/>
+                <w:sz w:val="19"/>
+                <w:szCs w:val="19"/>
+              </w:rPr>
+              <w:t xml:space="preserve">COPA document grouping number</w:t>
+            </w:r>
+          </w:p>
+        </w:tc>
+        <w:tc>
+          <w:tcPr>
+            <w:tcW w:type="dxa" w:w="3226"/>
+            <w:tcMar>
+              <w:top w:type="dxa" w:w="60"/>
+              <w:left w:type="dxa" w:w="100"/>
+              <w:bottom w:type="dxa" w:w="60"/>
+              <w:right w:type="dxa" w:w="100"/>
+            </w:tcMar>
+          </w:tcPr>
+          <w:p>
+            <w:r>
+              <w:rPr>
+                <w:b w:val="false"/>
+                <w:bCs w:val="false"/>
+                <w:sz w:val="19"/>
+                <w:szCs w:val="19"/>
+              </w:rPr>
+              <w:t xml:space="preserve">Recreated identically in S/4</w:t>
+            </w:r>
+          </w:p>
+        </w:tc>
+      </w:tr>
+      <w:tr>
+        <w:trPr>
+          <w:tblHeader w:val="false"/>
+        </w:trPr>
+        <w:tc>
+          <w:tcPr>
+            <w:tcW w:type="dxa" w:w="3300"/>
+            <w:tcMar>
+              <w:top w:type="dxa" w:w="60"/>
+              <w:left w:type="dxa" w:w="100"/>
+              <w:bottom w:type="dxa" w:w="60"/>
+              <w:right w:type="dxa" w:w="100"/>
+            </w:tcMar>
+          </w:tcPr>
+          <w:p>
+            <w:r>
+              <w:rPr>
+                <w:b w:val="false"/>
+                <w:bCs w:val="false"/>
+                <w:sz w:val="19"/>
+                <w:szCs w:val="19"/>
+              </w:rPr>
+              <w:t xml:space="preserve">TVARVC settings (record types, rates, accounts)</w:t>
+            </w:r>
+          </w:p>
+        </w:tc>
+        <w:tc>
+          <w:tcPr>
+            <w:tcW w:type="dxa" w:w="2500"/>
+            <w:tcMar>
+              <w:top w:type="dxa" w:w="60"/>
+              <w:left w:type="dxa" w:w="100"/>
+              <w:bottom w:type="dxa" w:w="60"/>
+              <w:right w:type="dxa" w:w="100"/>
+            </w:tcMar>
+          </w:tcPr>
+          <w:p>
+            <w:r>
+              <w:rPr>
+                <w:b w:val="false"/>
+                <w:bCs w:val="false"/>
+                <w:sz w:val="19"/>
+                <w:szCs w:val="19"/>
+              </w:rPr>
+              <w:t xml:space="preserve">Program configuration</w:t>
+            </w:r>
+          </w:p>
+        </w:tc>
+        <w:tc>
+          <w:tcPr>
+            <w:tcW w:type="dxa" w:w="3226"/>
+            <w:tcMar>
+              <w:top w:type="dxa" w:w="60"/>
+              <w:left w:type="dxa" w:w="100"/>
+              <w:bottom w:type="dxa" w:w="60"/>
+              <w:right w:type="dxa" w:w="100"/>
+            </w:tcMar>
+          </w:tcPr>
+          <w:p>
+            <w:r>
+              <w:rPr>
+                <w:b w:val="false"/>
+                <w:bCs w:val="false"/>
+                <w:sz w:val="19"/>
+                <w:szCs w:val="19"/>
+              </w:rPr>
+              <w:t xml:space="preserve">Migrated to S/4 TVARVC; obsolete entries (HANA connection, file path) retired</w:t>
+            </w:r>
+          </w:p>
+        </w:tc>
+      </w:tr>
+      <w:tr>
+        <w:trPr>
+          <w:tblHeader w:val="false"/>
+        </w:trPr>
+        <w:tc>
+          <w:tcPr>
+            <w:tcW w:type="dxa" w:w="3300"/>
+            <w:tcMar>
+              <w:top w:type="dxa" w:w="60"/>
+              <w:left w:type="dxa" w:w="100"/>
+              <w:bottom w:type="dxa" w:w="60"/>
+              <w:right w:type="dxa" w:w="100"/>
+            </w:tcMar>
+          </w:tcPr>
+          <w:p>
+            <w:r>
+              <w:rPr>
+                <w:b w:val="false"/>
+                <w:bCs w:val="false"/>
+                <w:sz w:val="19"/>
+                <w:szCs w:val="19"/>
+              </w:rPr>
+              <w:t xml:space="preserve">Secondary HANA database connection</w:t>
+            </w:r>
+          </w:p>
+        </w:tc>
+        <w:tc>
+          <w:tcPr>
+            <w:tcW w:type="dxa" w:w="2500"/>
+            <w:tcMar>
+              <w:top w:type="dxa" w:w="60"/>
+              <w:left w:type="dxa" w:w="100"/>
+              <w:bottom w:type="dxa" w:w="60"/>
+              <w:right w:type="dxa" w:w="100"/>
+            </w:tcMar>
+          </w:tcPr>
+          <w:p>
+            <w:r>
+              <w:rPr>
+                <w:b w:val="false"/>
+                <w:bCs w:val="false"/>
+                <w:sz w:val="19"/>
+                <w:szCs w:val="19"/>
+              </w:rPr>
+              <w:t xml:space="preserve">Let ECC read BW data</w:t>
+            </w:r>
+          </w:p>
+        </w:tc>
+        <w:tc>
+          <w:tcPr>
+            <w:tcW w:type="dxa" w:w="3226"/>
+            <w:tcMar>
+              <w:top w:type="dxa" w:w="60"/>
+              <w:left w:type="dxa" w:w="100"/>
+              <w:bottom w:type="dxa" w:w="60"/>
+              <w:right w:type="dxa" w:w="100"/>
+            </w:tcMar>
+          </w:tcPr>
+          <w:p>
+            <w:r>
+              <w:rPr>
+                <w:b w:val="false"/>
+                <w:bCs w:val="false"/>
+                <w:sz w:val="19"/>
+                <w:szCs w:val="19"/>
+              </w:rPr>
+              <w:t xml:space="preserve">Not needed — everything is in one system</w:t>
+            </w:r>
+          </w:p>
+        </w:tc>
+      </w:tr>
+    </w:tbl>
+    <w:p>
+      <w:pPr>
+        <w:pStyle w:val="Heading1"/>
+        <w:spacing w:after="160" w:before="320"/>
+      </w:pPr>
+      <w:r>
+        <w:rPr>
+          <w:color w:val="1F4E79"/>
+        </w:rPr>
+        <w:t xml:space="preserve">3. The new process flow — month end</w:t>
       </w:r>
     </w:p>
     <w:p>
@@ -681,7 +1929,7 @@
         <w:rPr>
           <w:color w:val="1F4E79"/>
         </w:rPr>
-        <w:t xml:space="preserve">3. New tables that will be created</w:t>
+        <w:t xml:space="preserve">4. New tables that will be created</w:t>
       </w:r>
     </w:p>
     <w:p>
@@ -701,7 +1949,7 @@
         <w:rPr>
           <w:color w:val="1F4E79"/>
         </w:rPr>
-        <w:t xml:space="preserve">3.1  /CCBJI/T_KAM_L4_CC — KAM organisation to cost center</w:t>
+        <w:t xml:space="preserve">4.1  /CCBJI/T_KAM_L4_CC — KAM organisation to cost center</w:t>
       </w:r>
     </w:p>
     <w:p>
@@ -955,7 +2203,7 @@
         <w:rPr>
           <w:color w:val="1F4E79"/>
         </w:rPr>
-        <w:t xml:space="preserve">3.2  /CCBJI/T_SUPFEE_CE — cost element for COPA posting</w:t>
+        <w:t xml:space="preserve">4.2  /CCBJI/T_SUPFEE_CE — cost element for COPA posting</w:t>
       </w:r>
     </w:p>
     <w:p>
@@ -1280,7 +2528,7 @@
         <w:rPr>
           <w:color w:val="1F4E79"/>
         </w:rPr>
-        <w:t xml:space="preserve">3.3  /CCBJI/T_GL_TYPE — G/L account classification (new business rule)</w:t>
+        <w:t xml:space="preserve">4.3  /CCBJI/T_GL_TYPE — G/L account classification (new business rule)</w:t>
       </w:r>
     </w:p>
     <w:p>
@@ -1534,7 +2782,7 @@
         <w:rPr>
           <w:color w:val="1F4E79"/>
         </w:rPr>
-        <w:t xml:space="preserve">3.4  /CCBJI/T_RPPCAT_TY — RPP category classification (new business rule)</w:t>
+        <w:t xml:space="preserve">4.4  /CCBJI/T_RPPCAT_TY — RPP category classification (new business rule)</w:t>
       </w:r>
     </w:p>
     <w:tbl>
@@ -1780,7 +3028,7 @@
         <w:rPr>
           <w:color w:val="1F4E79"/>
         </w:rPr>
-        <w:t xml:space="preserve">3.5  Small settings (TVARVC variables)</w:t>
+        <w:t xml:space="preserve">4.5  Small settings (TVARVC variables)</w:t>
       </w:r>
     </w:p>
     <w:tbl>
@@ -2105,7 +3353,7 @@
         <w:rPr>
           <w:color w:val="1F4E79"/>
         </w:rPr>
-        <w:t xml:space="preserve">4. Existing tables the program will use</w:t>
+        <w:t xml:space="preserve">5. Existing tables the program will use</w:t>
       </w:r>
     </w:p>
     <w:p>
@@ -2634,7 +3882,7 @@
         <w:rPr>
           <w:color w:val="1F4E79"/>
         </w:rPr>
-        <w:t xml:space="preserve">5. The selection screen</w:t>
+        <w:t xml:space="preserve">6. The selection screen</w:t>
       </w:r>
     </w:p>
     <w:p>
@@ -3617,7 +4865,7 @@
         <w:rPr>
           <w:color w:val="1F4E79"/>
         </w:rPr>
-        <w:t xml:space="preserve">6. How the program works inside</w:t>
+        <w:t xml:space="preserve">7. How the program works inside</w:t>
       </w:r>
     </w:p>
     <w:p>
@@ -3707,7 +4955,7 @@
         <w:rPr>
           <w:color w:val="1F4E79"/>
         </w:rPr>
-        <w:t xml:space="preserve">7. How performance is handled</w:t>
+        <w:t xml:space="preserve">8. How performance is handled</w:t>
       </w:r>
     </w:p>
     <w:p>
@@ -3766,7 +5014,7 @@
         <w:rPr>
           <w:color w:val="1F4E79"/>
         </w:rPr>
-        <w:t xml:space="preserve">8. Safety features</w:t>
+        <w:t xml:space="preserve">9. Safety features</w:t>
       </w:r>
     </w:p>
     <w:p>
@@ -3830,7 +5078,7 @@
         <w:rPr>
           <w:color w:val="1F4E79"/>
         </w:rPr>
-        <w:t xml:space="preserve">9. What we still need from the business side</w:t>
+        <w:t xml:space="preserve">10. What we still need from the business side</w:t>
       </w:r>
     </w:p>
     <w:tbl>

</xml_diff>